<commit_message>
docs: complète le rapport du 18 septembre 2026
Ajoute le choix Client/Prestataire dans l'en-tête, l'en-tête sur les
écrans professionnels, le menu Profil/Déconnexion et l'habillage de la
messagerie et des notifications.
</commit_message>
<xml_diff>
--- a/docs/rapport-client-2026-09-18.docx
+++ b/docs/rapport-client-2026-09-18.docx
@@ -1271,6 +1271,118 @@
           <w:szCs w:val="22"/>
         </w:rPr>
         <w:t xml:space="preserve">La note laissée par un client sur un professionnel se saisissait via une liste déroulante et s'affichait ensuite en chiffres sur la fiche du professionnel, alors que la note se donne en étoiles partout ailleurs sur le site. Les deux écrans reprennent maintenant ce même langage visuel : une rangée de cinq étoiles cliquables pour la saisie, la même rangée, remplie selon la note, pour l'affichage.</w:t>
+      </w:r>
+    </w:p>
+    <w:p>
+      <w:pPr>
+        <w:spacing w:after="60" w:before="200"/>
+      </w:pPr>
+      <w:r>
+        <w:rPr>
+          <w:b/>
+          <w:bCs/>
+          <w:color w:val="222222"/>
+          <w:sz w:val="22"/>
+          <w:szCs w:val="22"/>
+        </w:rPr>
+        <w:t xml:space="preserve">Connexion directe depuis l'en-tête, avec un choix Client ou Prestataire</w:t>
+      </w:r>
+    </w:p>
+    <w:p>
+      <w:pPr>
+        <w:spacing w:after="160"/>
+        <w:jc w:val="both"/>
+      </w:pPr>
+      <w:r>
+        <w:rPr>
+          <w:sz w:val="22"/>
+          <w:szCs w:val="22"/>
+        </w:rPr>
+        <w:t xml:space="preserve">Le bouton « S'inscrire » de l'en-tête, qui menait à l'écran de choix du profil, devient « Se connecter » : un clic ouvre un choix entre Client et Prestataire, qui mène directement à l'écran de connexion correspondant. L'inscription reste accessible en un clic depuis ces deux écrans de connexion, vers ce même écran de choix qui présente les deux profils.</w:t>
+      </w:r>
+    </w:p>
+    <w:p>
+      <w:pPr>
+        <w:spacing w:after="60" w:before="200"/>
+      </w:pPr>
+      <w:r>
+        <w:rPr>
+          <w:b/>
+          <w:bCs/>
+          <w:color w:val="222222"/>
+          <w:sz w:val="22"/>
+          <w:szCs w:val="22"/>
+        </w:rPr>
+        <w:t xml:space="preserve">En-tête ajouté aux écrans de connexion et d'inscription professionnels</w:t>
+      </w:r>
+    </w:p>
+    <w:p>
+      <w:pPr>
+        <w:spacing w:after="160"/>
+        <w:jc w:val="both"/>
+      </w:pPr>
+      <w:r>
+        <w:rPr>
+          <w:sz w:val="22"/>
+          <w:szCs w:val="22"/>
+        </w:rPr>
+        <w:t xml:space="preserve">Les écrans de connexion et d'inscription professionnels n'affichaient ni en-tête ni pied de page, à la différence du reste du parcours d'authentification. Ils affichent désormais le même en-tête réduit que les écrans client, avec le même accès à la connexion.</w:t>
+      </w:r>
+    </w:p>
+    <w:p>
+      <w:pPr>
+        <w:spacing w:after="60" w:before="200"/>
+      </w:pPr>
+      <w:r>
+        <w:rPr>
+          <w:b/>
+          <w:bCs/>
+          <w:color w:val="222222"/>
+          <w:sz w:val="22"/>
+          <w:szCs w:val="22"/>
+        </w:rPr>
+        <w:t xml:space="preserve">Un menu pour l'avatar connecté, avec une vraie confirmation avant de se déconnecter</w:t>
+      </w:r>
+    </w:p>
+    <w:p>
+      <w:pPr>
+        <w:spacing w:after="160"/>
+        <w:jc w:val="both"/>
+      </w:pPr>
+      <w:r>
+        <w:rPr>
+          <w:sz w:val="22"/>
+          <w:szCs w:val="22"/>
+        </w:rPr>
+        <w:t xml:space="preserve">Cliquer sur l'avatar de l'en-tête menait directement au tableau de bord, sans aucun accès rapide à la déconnexion depuis cet endroit. Un clic ouvre désormais un petit menu proposant Profil ou Déconnexion ; la déconnexion ouvre une fenêtre de confirmation plutôt que de déconnecter directement, avec « Annuler » pour revenir en arrière.</w:t>
+      </w:r>
+    </w:p>
+    <w:p>
+      <w:pPr>
+        <w:spacing w:after="60" w:before="200"/>
+      </w:pPr>
+      <w:r>
+        <w:rPr>
+          <w:b/>
+          <w:bCs/>
+          <w:color w:val="222222"/>
+          <w:sz w:val="22"/>
+          <w:szCs w:val="22"/>
+        </w:rPr>
+        <w:t xml:space="preserve">Messagerie et notifications : un habillage cohérent avec le reste du site</w:t>
+      </w:r>
+    </w:p>
+    <w:p>
+      <w:pPr>
+        <w:spacing w:after="160"/>
+        <w:jc w:val="both"/>
+      </w:pPr>
+      <w:r>
+        <w:rPr>
+          <w:sz w:val="22"/>
+          <w:szCs w:val="22"/>
+        </w:rPr>
+        <w:t xml:space="preserve">La liste des conversations et le fil de discussion reposaient sur des composants génériques, sans rapport visuel avec le reste du site. Ils reprennent maintenant le même habillage (cartes, bulles, couleurs de la charte). Une conversation ou une notification non lue se distingue désormais clairement de celles déjà lues par un fond gris, qui disparaît une fois consultée.</w:t>
       </w:r>
     </w:p>
     <w:p>

</xml_diff>